<commit_message>
Revise patent draft per review: tighten proofs and NN fusion.
- Fix reference-path definition and segment-wise invariance proof in Section 4.5
- Remove error-saturation and redundant constraint emphasis from Section 4.3
- Expand NN closed-loop fusion with deviation metrics and confidence interaction
- Strengthen pole-mapping calibration and spatio-temporal fusion descriptions
- Update figure captions, input table, and section ordering

Co-authored-by: Elowny <Elowny@users.noreply.github.com>
</commit_message>
<xml_diff>
--- a/IR_Trajectory_Generation_Pole_Placement_revised.docx
+++ b/IR_Trajectory_Generation_Pole_Placement_revised.docx
@@ -864,10 +864,12 @@
         <w:t>Quantitative Path-Speed Decoupling via Nominal Virtual Speed: The method introduces a formal decoupling between spatial path geometry and the vehicle's actual longitudinal speed. Path shape is generated under a nominal virtual speed v_nom = PLF_path(v_actual), which is bounded to a well-conditioned operating range. Section 4.5 provides a quantitative proof that, within each constant segment of PLF_path, the generated spatial path is invariant to actual speed — eliminating the path-shape distortion that plagues coupled methods at extreme speeds.</w:t>
       </w:r>
     </w:p>
-    <w:p/>
-    <w:p>
-      <w:r>
-        <w:t>Systematic Pole Mapping Calibration: Beyond ad-hoc lookup tables, the velocity-to-pole mapping PLF(v) is calibrated through a multi-objective optimization framework that jointly minimizes lateral tracking error, heading error rate, and a comfort metric (e.g., peak lateral jerk or steering rate). The calibration produces speed-segmented pole assignments with provable stability margins at each operating point (Section 4.6).</w:t>
+    <w:p>
+      <w:r/>
+    </w:p>
+    <w:p>
+      <w:r>
+        <w:t>Systematic Pole Mapping Calibration: The velocity-to-pole mapping PLF(v) is obtained through a multi-objective optimization framework that jointly minimizes lateral tracking error, heading error rate, and a comfort metric (e.g., peak lateral jerk or steering rate). The calibration produces speed-segmented pole assignments with provable stability margins at each operating point (Section 4.6).</w:t>
       </w:r>
     </w:p>
     <w:p>
@@ -877,7 +879,7 @@
     </w:p>
     <w:p>
       <w:r>
-        <w:t>Closed-Loop Neural Network Trajectory Fusion: For neural-network-based predictors, the same pole placement controller operates in heading-difference feedforward mode as a closed-loop kinematic refiner. The fusion mechanism computes explicit kinematic deviation metrics between the NN raw output and the refined trajectory, and uses these metrics together with the NN mode probability to decide whether to accept the refined trajectory, retain the raw output, or blend the two — providing a unique confidence-aware hybrid prediction pipeline (Section 4.7).</w:t>
+        <w:t>Closed-Loop Neural Network Trajectory Fusion: For neural-network-based predictors, the same pole placement controller operates in heading-difference feedforward mode as a closed-loop kinematic refiner. The fusion mechanism computes explicit kinematic deviation metrics between the NN raw output and the refined trajectory, and adjusts the NN mode probability through a confidence interaction function — yielding a unique confidence-aware hybrid prediction pipeline (Section 4.7).</w:t>
       </w:r>
     </w:p>
     <w:p>
@@ -1677,12 +1679,7 @@
         <w:jc w:val="center"/>
       </w:pPr>
       <w:r>
-        <w:rPr>
-          <w:i/>
-          <w:color w:val="555555"/>
-          <w:sz w:val="18"/>
-        </w:rPr>
-        <w:t>Figure 2: Reference Path Construction — (a) sampling waypoints from the Drive Passage with target lateral offset, (b) dual curve fitting using cubic spline and 5th-order polynomial, (c) dense reference points with position, heading angle (arrows), and curvature.</w:t>
+        <w:t>Figure 2: Reference Path Construction — (a) sampling waypoints from the Drive Passage with target lateral offset L_target, (b) smooth parametric curve fitting x(s), y(s), (c) dense reference points with position, heading angle (arrows), and curvature.</w:t>
       </w:r>
     </w:p>
     <w:p>
@@ -1794,12 +1791,7 @@
         <w:jc w:val="center"/>
       </w:pPr>
       <w:r>
-        <w:rPr>
-          <w:i/>
-          <w:color w:val="555555"/>
-          <w:sz w:val="18"/>
-        </w:rPr>
-        <w:t>Figure 4: Feedforward + Feedback Pole Placement Control Loop — the reference path provides curvature (κ) to the feedforward controller and position/heading to the error computation block. The feedback controller uses velocity-adaptive pole placement gains. Physical constraints are applied before the bicycle model update. The vehicle state feeds back for the next iteration.</w:t>
+        <w:t>Figure 4: Feedforward + Feedback Pole Placement Control Loop — the reference path provides curvature (κ) to the feedforward controller and position/heading to the error computation block. The feedback controller uses velocity-adaptive pole placement gains. The bicycle model state feeds back for the next iteration.</w:t>
       </w:r>
     </w:p>
     <w:p>
@@ -2268,17 +2260,7 @@
           </w:tcPr>
           <w:p>
             <w:r>
-              <w:rPr>
-                <w:sz w:val="18"/>
-              </w:rPr>
-              <w:t>Past 1.0s trajectory</w:t>
-            </w:r>
-            <w:r>
-              <w:rPr>
-                <w:sz w:val="18"/>
-              </w:rPr>
-              <w:br/>
-              <w:t>states</w:t>
+              <w:t>Past 1.0 s trajectory states</w:t>
             </w:r>
           </w:p>
         </w:tc>
@@ -2288,10 +2270,7 @@
           </w:tcPr>
           <w:p>
             <w:r>
-              <w:rPr>
-                <w:sz w:val="18"/>
-              </w:rPr>
-              <w:t>Historical positions, velocities, and timestamps for fitting lateral speed and longitudinal acceleration</w:t>
+              <w:t>Historical positions, velocities, and timestamps used to estimate target lateral offset L_target and longitudinal acceleration trend for independent speed planning</w:t>
             </w:r>
           </w:p>
         </w:tc>
@@ -4089,10 +4068,7 @@
     </w:p>
     <w:p>
       <w:r>
-        <w:rPr>
-          <w:sz w:val="22"/>
-        </w:rPr>
-        <w:t>In practice, the vehicle velocity changes over time, making the pole p(v) and the closed-loop matrix time-varying — the controller is effectively a gain-scheduled (or linear parameter-varying, LPV) system. A complete Lyapunov analysis for the time-varying case is beyond the scope of this report. However, under the slowly-varying assumption (bounded longitudinal acceleration |v̇| small relative to the convergence rate |p|), the frozen-time eigenvalues remain strictly inside the unit circle at every time step, ensuring practical (input-to-state) stability of the velocity-scheduled closed loop. This assumption is well-justified in the prediction context: the longitudinal acceleration is bounded within [−9.8, +4.0] m/s², while the pole magnitude |p(v)| ranges from 0.2 to 3.0 s⁻¹, providing a large separation between the parameter scheduling rate and the error convergence rate.</w:t>
+        <w:t>In practice, the vehicle velocity changes over time, making the pole p(v) and the closed-loop matrix time-varying — the controller is effectively a gain-scheduled (or linear parameter-varying, LPV) system. Under the slowly-varying assumption (the scheduling rate of v is small relative to the error convergence rate |p|), the frozen-time eigenvalues remain strictly inside the unit circle at every time step, ensuring practical input-to-state stability of the velocity-scheduled closed loop.</w:t>
       </w:r>
     </w:p>
     <w:p>
@@ -4112,9 +4088,6 @@
     </w:p>
     <w:p>
       <w:r>
-        <w:rPr>
-          <w:sz w:val="22"/>
-        </w:rPr>
         <w:t>The complete feedback steering command at each simulation step is:</w:t>
       </w:r>
     </w:p>
@@ -4123,22 +4096,11 @@
         <w:jc w:val="center"/>
       </w:pPr>
       <w:r>
-        <w:rPr>
-          <w:rFonts w:ascii="Cambria Math" w:hAnsi="Cambria Math"/>
-          <w:i/>
-          <w:sz w:val="24"/>
-        </w:rPr>
-        <w:t>δ_fb = clamp(e_lat, ±2.0 m) · k_lat  +  clamp(e_head, ±0.175 rad) · k_head</w:t>
-      </w:r>
-    </w:p>
-    <w:p>
-      <w:r>
-        <w:rPr>
-          <w:sz w:val="22"/>
-        </w:rPr>
-        <w:lastRenderedPageBreak/>
-        <w:t>The error clamping (saturation) prevents extreme corrections when the vehicle is far from the reference path, providing graceful degradation beyond the linear regime.</w:t>
-      </w:r>
+        <w:t>δ_fb = k_lat(v) · e_lat + k_head(v) · e_head</w:t>
+      </w:r>
+    </w:p>
+    <w:p>
+      <w:r/>
     </w:p>
     <w:p>
       <w:pPr>
@@ -4328,7 +4290,7 @@
     </w:p>
     <w:p>
       <w:r>
-        <w:t>where x₀ is the initial bicycle state, R = {(p_i, θ_i, κ_i)} is the reference path (determined solely by Drive Passage geometry and L_target), v_control is the speed input to the controller, δ_ff is the curvature feedforward, and K(v) = [k_lat(v), k_head(v)] are the pole-placement feedback gains.</w:t>
+        <w:t>where x₀ is the initial bicycle state; R(v_nom) = {(p_i, θ_i, κ_i)} is the reference path constructed from Drive Passage geometry, target lateral offset L_target, and sampling horizon D_sample = T_horizon × (v_nom + v_offset); v_control is the speed input to the controller; δ_ff is the curvature feedforward; and K(v) = [k_lat(v), k_head(v)] are the pole-placement feedback gains.</w:t>
       </w:r>
     </w:p>
     <w:p>
@@ -4336,18 +4298,18 @@
         <w:jc w:val="center"/>
       </w:pPr>
       <w:r>
-        <w:t>Proposition: In decoupled mode, v_control = v_nom = PLF_path(v_actual). For any two actual speeds v₁, v₂ such that PLF_path(v₁) = PLF_path(v₂) = v̄, the generated spatial paths are identical: Φ(·, v̄) = Φ(·, v̄), independent of whether the vehicle is moving at v₁ or v₂.</w:t>
-      </w:r>
-    </w:p>
-    <w:p>
-      <w:r>
-        <w:t>Proof sketch: (1) The reference path R depends on v_actual only through the sampling distance D_sample = T_horizon × (v_nom + v_offset). Since v_nom = PLF_path(v_actual) is constant over each speed segment (e.g., v_actual ∈ [0, 10] m/s → v_nom = 5.0 m/s), R is identical for all v_actual within that segment. (2) The feedback gains K(v_nom) depend exclusively on v_nom, not v_actual. (3) The feedforward δ_ff = arctan(κ·L) depends only on reference curvature, not speed. (4) The forward simulation with constant reference speed profile ref_v[i] = v_nom produces identical state transitions at each step k when v_nom is fixed. Therefore, the entire discrete trajectory {(x_k, y_k, θ_k)} is a function of v_nom alone: P = Φ(R, v_nom). Actual speed v_actual affects P only through the piecewise-constant mapping PLF_path, never directly. □</w:t>
+        <w:t>Proposition (Segment-wise Path-Shape Invariance): In decoupled Mode A, v_control = v_nom = PLF_path(v_actual). For any two actual speeds v₁, v₂ such that PLF_path(v₁) = PLF_path(v₂) = v̄, the generated spatial paths are identical: Φ(x₀, R(v̄), v̄) is independent of whether the vehicle's actual speed is v₁ or v₂.</w:t>
+      </w:r>
+    </w:p>
+    <w:p>
+      <w:r>
+        <w:t>Proof sketch: (1) The reference path R(v_nom) depends on v_actual only through v_nom via D_sample = T_horizon × (v_nom + v_offset). Since v_nom = PLF_path(v_actual) is piecewise constant (e.g., v_actual ∈ [0, 10] m/s ⇒ v_nom = 5.0 m/s), R(v_nom) is identical for all v_actual within that segment. (2) The feedback gains K(v_nom) depend exclusively on v_nom. (3) The feedforward δ_ff = arctan(κ·L) depends only on reference curvature. (4) The forward simulation uses a constant speed profile ref_v[k] = v_nom at every step, so each discrete state transition is identical when v_nom is fixed. Therefore P = Φ(R(v_nom), v_nom), and v_actual influences P only through the piecewise-constant mapping PLF_path, never directly. □</w:t>
       </w:r>
     </w:p>
     <w:p>
       <w:pPr/>
       <w:r>
-        <w:t>Corollary (Bounded Path Distortion): Even across speed segments where v_nom changes, the path distortion is bounded by the ratio v_max_nom / v_min_nom (typically 3:1), as opposed to unbounded distortion in coupled methods where a 30× speed change (1 m/s vs. 30 m/s) would produce a 30× change in reference point density and pole magnitude.</w:t>
+        <w:t>Corollary (Bounded Cross-Segment Distortion): Across PLF_path segments where v_nom changes, spatial path distortion is bounded by the ratio v_max_nom / v_min_nom (typically 3:1 for [5, 15] m/s), whereas coupled methods can exhibit unbounded distortion (e.g., a 30× speed ratio produces ~30× change in reference-point density and pole magnitude).</w:t>
       </w:r>
     </w:p>
     <w:p>
@@ -4402,7 +4364,7 @@
     </w:p>
     <w:p>
       <w:r>
-        <w:t>Rather than relying solely on hand-tuned lookup tables, the velocity-to-pole mapping PLF(v) is systematically calibrated using recorded driving or simulation data.</w:t>
+        <w:t>The velocity-to-pole mapping PLF(v) is systematically calibrated from recorded driving or high-fidelity simulation data. Calibration is performed offline and deployed as a piecewise-linear lookup table at runtime.</w:t>
       </w:r>
     </w:p>
     <w:p>
@@ -4942,7 +4904,7 @@
     </w:p>
     <w:p>
       <w:r>
-        <w:t>The calibrated PLF(v) is cross-validated on held-out scenarios including lane changes, curved roads, and low-speed urban driving. Compared to fixed-pole controllers, the calibrated mapping reduces mean lateral tracking error by adapting convergence aggressiveness to speed while maintaining the comfort bound J_comfort below a predefined threshold.</w:t>
+        <w:t>The calibrated PLF(v) is cross-validated on held-out scenarios (lane changes, curved roads, low-speed urban driving). Deployment criteria require simultaneous satisfaction of: (i) mean tracking error J_track below a preset threshold at each speed knot, (ii) comfort bound J_comfort below a passenger-comfort limit, and (iii) stability certificate |z(v)| ≤ 1 − ε for all v in the operating envelope.</w:t>
       </w:r>
     </w:p>
     <w:p>
@@ -4986,30 +4948,39 @@
     <w:p>
       <w:pPr/>
       <w:r>
-        <w:t>Neural network predictors (e.g., ActNet) generate trajectories that capture complex driving intentions but may violate kinematic constraints, especially at low speeds. This invention provides a unique closed-loop fusion mechanism that uses the pole placement controller as a kinematic refiner while preserving the NN's high-level intent through explicit deviation metrics and confidence interaction.</w:t>
-      </w:r>
-    </w:p>
-    <w:p>
+        <w:t>Neural network predictors (e.g., ActNet) capture complex driving intentions but may produce kinematically inconsistent trajectories at low speeds (discontinuous heading, excessive curvature). This invention closes the loop: the NN output serves as a spatial intent reference, and the pole placement controller re-simulates a physically feasible trajectory from the measured initial state — while quantifying the kinematic gap and adjusting prediction confidence accordingly.</w:t>
+      </w:r>
+    </w:p>
+    <w:p>
+      <w:pPr>
+        <w:pStyle w:val="3"/>
+      </w:pPr>
       <w:r>
         <w:t>4.7.1 Trigger Condition: Slow-Moving Trajectory Detection</w:t>
       </w:r>
     </w:p>
     <w:p>
       <w:r>
-        <w:t>The fusion is activated when the NN output is classified as a slow-moving trajectory: any trajectory point with speed below a threshold (2.0 m/s) or total arc length below a distance threshold (16.0 m). Fast-moving trajectories bypass refinement, as NN outputs at highway speeds are typically kinematically consistent.</w:t>
-      </w:r>
-    </w:p>
-    <w:p>
+        <w:t>Fusion is activated when the NN output is classified as slow-moving: any trajectory point with speed below 2.0 m/s, or total arc length below 16.0 m. Fast-moving trajectories bypass closed-loop refinement because NN outputs at highway speeds are typically kinematically consistent.</w:t>
+      </w:r>
+    </w:p>
+    <w:p>
+      <w:pPr>
+        <w:pStyle w:val="3"/>
+      </w:pPr>
       <w:r>
         <w:t>4.7.2 Closed-Loop Refinement Pipeline</w:t>
       </w:r>
     </w:p>
     <w:p>
       <w:r>
-        <w:t>When triggered, the NN trajectory points are converted to a reference sequence with heading-difference feedforward mode (Section 4.4.2). The pole placement controller re-simulates the vehicle from its current measured state, tracking the NN reference via closed-loop feedback. The output is a kinematically feasible trajectory that preserves the NN's spatial intent while enforcing bicycle model dynamics.</w:t>
-      </w:r>
-    </w:p>
-    <w:p>
+        <w:t>When triggered, the pipeline executes four stages: (1) Pre-processing — clamp curvature to a feasible range and limit step-to-step heading changes to remove NN artifacts; (2) Reference construction — convert NN polyline points to a reference sequence; map center points to rear-axle references when speed is low; (3) Closed-loop re-simulation — TrackTrajectoryByPolePlacement with heading-difference feedforward (Section 4.4.2), starting from the measured bicycle state; (4) Acceptance — replace the raw NN trajectory with the refined output if the refined trajectory contains sufficient valid points and does not terminate prematurely.</w:t>
+      </w:r>
+    </w:p>
+    <w:p>
+      <w:pPr>
+        <w:pStyle w:val="3"/>
+      </w:pPr>
       <w:r>
         <w:t>4.7.3 Kinematic Deviation Metrics</w:t>
       </w:r>
@@ -5017,52 +4988,60 @@
     <w:p>
       <w:pPr/>
       <w:r>
-        <w:t>After refinement, the system computes explicit deviation metrics between the raw NN trajectory T_NN and the refined trajectory T_ref:</w:t>
-      </w:r>
-    </w:p>
-    <w:p>
-      <w:r>
-        <w:t>D_lat = max_k |e_lat(T_NN(k), T_ref)|  — maximum lateral deviation</w:t>
+        <w:t>After refinement, explicit deviation metrics quantify the kinematic gap between the raw NN trajectory T_NN and the refined trajectory T_ref:</w:t>
+      </w:r>
+    </w:p>
+    <w:p>
+      <w:r>
+        <w:t>D_lat = max_k |e_lat(T_NN(k), T_ref)|     — maximum lateral deviation (m)</w:t>
         <w:br/>
-        <w:t>D_head = max_k |e_head(T_NN(k), T_ref)|  — maximum heading deviation</w:t>
+        <w:t>D_head = max_k |e_head(T_NN(k), T_ref)|   — maximum heading deviation (rad)</w:t>
         <w:br/>
-        <w:t>D_κ = max_k |κ_NN(k) − κ_ref(k)|  — maximum curvature deviation</w:t>
-      </w:r>
-    </w:p>
-    <w:p>
-      <w:r>
-        <w:t>If D_lat or D_head exceeds a threshold, the refined trajectory replaces the raw output (the NN output is deemed kinematically inconsistent). If deviations are small, the refined trajectory is accepted as a minor correction. This metric-driven gating is unique to the closed-loop architecture — open-loop post-processing (e.g., curvature clamping) cannot quantify the kinematic fidelity of the correction.</w:t>
-      </w:r>
-    </w:p>
-    <w:p>
+        <w:t>D_κ = max_k |κ_NN(k) − κ_ref(k)|          — maximum curvature deviation (m⁻¹)</w:t>
+        <w:br/>
+        <w:t>D_composite = w_lat·D_lat + w_head·D_head + w_κ·D_κ   — weighted composite deviation</w:t>
+      </w:r>
+    </w:p>
+    <w:p>
+      <w:r>
+        <w:t>Decision logic: if D_composite &gt; τ_high, the NN output is deemed kinematically inconsistent and the refined trajectory fully replaces it; if τ_low &lt; D_composite ≤ τ_high, the refined trajectory is accepted with reduced confidence; if D_composite ≤ τ_low, the refined trajectory is accepted as a minor correction with confidence near the original NN probability. This metric-driven gating is unique to the closed-loop architecture — open-loop post-processing (e.g., curvature clamping alone) cannot quantify kinematic fidelity.</w:t>
+      </w:r>
+    </w:p>
+    <w:p>
+      <w:pPr>
+        <w:pStyle w:val="3"/>
+      </w:pPr>
       <w:r>
         <w:t>4.7.4 Confidence Interaction with NN Mode Probability</w:t>
       </w:r>
     </w:p>
     <w:p>
       <w:r>
-        <w:t>Each NN trajectory mode carries a probability p_mode from the network's softmax output. The fusion adjusts the effective prediction confidence as:</w:t>
-      </w:r>
-    </w:p>
-    <w:p>
-      <w:r>
-        <w:t>p_effective = p_mode · σ(−γ · (D_lat + D_head))</w:t>
+        <w:t>Each NN trajectory mode carries a softmax probability p_mode. The fusion adjusts the effective prediction confidence:</w:t>
+      </w:r>
+    </w:p>
+    <w:p>
+      <w:r>
+        <w:t>p_effective = p_mode · σ(−γ · D_composite)</w:t>
       </w:r>
     </w:p>
     <w:p>
       <w:pPr/>
       <w:r>
-        <w:t>where σ is a sigmoid function and γ is a sensitivity parameter. Trajectories with large kinematic deviation receive reduced effective probability, preventing downstream planners from over-trusting NN outputs that required significant kinematic correction. Conversely, trajectories where D_lat ≈ 0 retain their original NN confidence, indicating the NN output was already kinematically plausible.</w:t>
-      </w:r>
-    </w:p>
-    <w:p>
-      <w:r>
-        <w:t>4.7.5 Optional Speed Profile Rectification</w:t>
-      </w:r>
-    </w:p>
-    <w:p>
-      <w:r>
-        <w:t>When enabled, the refined spatial path is combined with a heuristic speed profile based on perception acceleration, decoupling speed from the spatial refinement. This two-stage approach (spatial refinement → speed assignment) mirrors the decoupled architecture of Section 4.5, ensuring consistent treatment of rule-based and NN-based predictions.</w:t>
+        <w:t>where σ is a sigmoid function and γ is a sensitivity parameter. Large D_composite drives p_effective toward zero, preventing downstream planners from over-trusting NN modes that required substantial kinematic correction. When D_composite ≈ 0, p_effective ≈ p_mode, indicating the NN output was already kinematically plausible. In multi-modal outputs, probabilities are re-normalized after adjustment: p̃_i = p_effective,i / Σ_j p_effective,j.</w:t>
+      </w:r>
+    </w:p>
+    <w:p>
+      <w:pPr>
+        <w:pStyle w:val="3"/>
+      </w:pPr>
+      <w:r>
+        <w:t>4.7.5 Speed Profile Rectification (Decoupled Fusion)</w:t>
+      </w:r>
+    </w:p>
+    <w:p>
+      <w:r>
+        <w:t>When speed rectification is enabled, the refined spatial path is combined with an independently planned speed profile (longitudinal acceleration trend + curvature-limited safe speed), mirroring the decoupled architecture of Section 4.5. Spatial refinement and temporal speed assignment are thus separated, ensuring consistent treatment of rule-based and NN-based predictions.</w:t>
       </w:r>
     </w:p>
     <w:p>
@@ -5087,17 +5066,20 @@
     </w:p>
     <w:p>
       <w:r>
-        <w:t>In decoupled mode (Mode A), the spatial path from Section 4.5 and an independently planned speed profile are fused through numerical integration: at each time step t_i, the speed profile provides s(t_i) and v(t_i), and the spatial path is queried at s(t_i) to obtain (x, y, θ, κ). The complete trajectory point {t_i, x, y, θ, κ, v, a, s} is assembled. If s(t_i) exceeds the path length before the horizon ends, the extension mechanism (Section 4.9) is activated.</w:t>
-      </w:r>
-    </w:p>
-    <w:p>
+        <w:t>In decoupled Mode A, spatial path (Section 4.5) and speed profile are fused by numerical integration. The speed profile is planned independently: longitudinal acceleration is estimated from motion history, then corrected by curvature-limited safe speed v_safe = √(a_lat_plan / κ_max) over a look-ahead window, and finally clamped to speed-dependent acceleration bounds. At each time step t_i, the speed profile provides s(t_i) and v(t_i); the spatial path is queried at s(t_i) to obtain (x, y, θ, κ). The complete point {t_i, x, y, θ, κ, v, a, s} is assembled. If s(t_i) exceeds path length before the horizon ends, Section 4.9 extension is activated.</w:t>
+      </w:r>
+    </w:p>
+    <w:p>
+      <w:pPr>
+        <w:pStyle w:val="2"/>
+      </w:pPr>
       <w:r>
         <w:t>4.9 Trajectory Extension Along Lane Tangent</w:t>
       </w:r>
     </w:p>
     <w:p>
       <w:r>
-        <w:t>When the generated trajectory does not cover the full prediction horizon (common in low-speed scenarios), the system extends the trajectory along the lane tangent direction at the last point, maintaining the last known speed and heading until the horizon is fully covered.</w:t>
+        <w:t>When the fused trajectory does not cover the full prediction horizon (common in low-speed scenarios), extension proceeds along the lane tangent at the last point, maintaining the last known speed and heading until the horizon is fully covered.</w:t>
       </w:r>
     </w:p>
     <w:p>
@@ -5117,6 +5099,7 @@
           <w:szCs w:val="22"/>
         </w:rPr>
       </w:pPr>
+      <w:r/>
     </w:p>
     <w:p>
       <w:pPr>
@@ -5132,6 +5115,7 @@
           <w:szCs w:val="22"/>
         </w:rPr>
       </w:pPr>
+      <w:r/>
     </w:p>
     <w:p>
       <w:pPr>
@@ -5142,6 +5126,7 @@
           <w:szCs w:val="22"/>
         </w:rPr>
       </w:pPr>
+      <w:r/>
     </w:p>
     <w:p>
       <w:pPr>
@@ -5152,37 +5137,40 @@
           <w:szCs w:val="22"/>
         </w:rPr>
       </w:pPr>
+      <w:r/>
+    </w:p>
+    <w:p>
+      <w:pPr>
+        <w:pStyle w:val="2"/>
+      </w:pPr>
+      <w:r>
+        <w:t>4.10 Alternative Embodiments</w:t>
+      </w:r>
     </w:p>
     <w:p>
       <w:pPr/>
       <w:r>
-        <w:t>Alternative Embodiment 4: Multi-Modal NN Fusion. When the NN outputs multiple trajectory modes, each mode is independently refined and its effective probability adjusted via Section 4.7.4, enabling confidence-aware multi-hypothesis prediction.</w:t>
+        <w:t>Alternative Embodiment 1: Road-Type-Adaptive Pole Mapping. The calibrated PLF(v) from Section 4.6 can be specialized by road type (highway vs. urban), selecting different Pareto-optimal solutions from the calibration Pareto front.</w:t>
       </w:r>
     </w:p>
     <w:p>
       <w:pPr/>
       <w:r>
+        <w:t>Alternative Embodiment 2: Model Predictive Control (MPC) Extension. The single-step pole placement controller can be extended to a receding-horizon MPC formulation for explicit handling of future constraints (e.g., upcoming lane narrowing).</w:t>
+      </w:r>
+    </w:p>
+    <w:p>
+      <w:pPr/>
+      <w:r>
         <w:t>Alternative Embodiment 3: Nonlinear Bicycle Model. The kinematic bicycle model can be replaced with a dynamic bicycle model including tire slip angles for improved high-speed accuracy.</w:t>
       </w:r>
     </w:p>
     <w:p>
-      <w:pPr/>
-      <w:r>
-        <w:t>Alternative Embodiment 2: Model Predictive Control (MPC) Extension. The single-step pole placement controller can be extended to a receding-horizon MPC formulation for explicit handling of future constraints.</w:t>
-      </w:r>
-    </w:p>
-    <w:p>
-      <w:pPr/>
-      <w:r>
-        <w:t>Alternative Embodiment 1: Road-Type-Adaptive Pole Mapping. The calibrated PLF(v) from Section 4.6 can be further specialized by road type (highway vs. urban), selecting different Pareto-optimal solutions from the calibration Pareto front.</w:t>
-      </w:r>
-    </w:p>
-    <w:p>
       <w:pPr>
         <w:pStyle w:val="2"/>
       </w:pPr>
       <w:r>
-        <w:t>4.10 Alternative Embodiments</w:t>
+        <w:t>Alternative Embodiment 4: Multi-Modal NN Fusion. When the NN outputs multiple trajectory modes, each mode is independently refined; p_effective is computed per mode via Section 4.7.4, and probabilities are re-normalized for confidence-aware multi-hypothesis prediction.</w:t>
       </w:r>
     </w:p>
     <w:p>
@@ -5198,44 +5186,7 @@
         </w:rPr>
       </w:pPr>
       <w:r>
-        <w:rPr>
-          <w:rFonts w:ascii="Calibri" w:hAnsi="Calibri" w:cs="Calibri"/>
-          <w:b/>
-          <w:bCs/>
-          <w:sz w:val="22"/>
-          <w:szCs w:val="22"/>
-        </w:rPr>
-        <w:t>2.6</w:t>
-      </w:r>
-      <w:r>
-        <w:rPr>
-          <w:rFonts w:ascii="Calibri" w:hAnsi="Calibri" w:cs="Calibri"/>
-          <w:b/>
-          <w:bCs/>
-          <w:sz w:val="22"/>
-          <w:szCs w:val="22"/>
-        </w:rPr>
-        <w:t xml:space="preserve"> Proving the Invention on Competitor Products</w:t>
-      </w:r>
-      <w:r>
-        <w:rPr>
-          <w:rFonts w:ascii="Calibri" w:hAnsi="Calibri" w:cs="Calibri"/>
-          <w:b/>
-          <w:bCs/>
-          <w:sz w:val="22"/>
-          <w:szCs w:val="22"/>
-        </w:rPr>
-        <w:t xml:space="preserve"> </w:t>
-      </w:r>
-      <w:r>
-        <w:rPr>
-          <w:rFonts w:ascii="Calibri" w:hAnsi="Calibri" w:cs="Calibri"/>
-          <w:b/>
-          <w:bCs/>
-          <w:sz w:val="22"/>
-          <w:szCs w:val="22"/>
-        </w:rPr>
-        <w:t>[OPTIONAL]</w:t>
+        <w:t>2.6 Proving the Invention on Competitor Products [OPTIONAL]</w:t>
       </w:r>
     </w:p>
     <w:p>

</xml_diff>

<commit_message>
Fix patent figure 4/5 display: correct image slot mapping and aspect ratios.
Word embeds images by filename slot, not figure number; regenerated
image2/image5 for figures 5/4 respectively and matched embed dimensions
to PNG aspect ratios for readable scaling.

Co-authored-by: Elowny <Elowny@users.noreply.github.com>
</commit_message>
<xml_diff>
--- a/IR_Trajectory_Generation_Pole_Placement_revised.docx
+++ b/IR_Trajectory_Generation_Pole_Placement_revised.docx
@@ -1170,7 +1170,7 @@
         <w:lastRenderedPageBreak/>
         <w:drawing>
           <wp:inline distT="0" distB="0" distL="0" distR="0" wp14:anchorId="0A502457" wp14:editId="3F8EE251">
-            <wp:extent cx="5943600" cy="3433597"/>
+            <wp:extent cx="5943600" cy="3489779"/>
             <wp:effectExtent l="0" t="0" r="0" b="0"/>
             <wp:docPr id="1" name="Picture 1"/>
             <wp:cNvGraphicFramePr>
@@ -1192,7 +1192,7 @@
                   <pic:spPr>
                     <a:xfrm>
                       <a:off x="0" y="0"/>
-                      <a:ext cx="5943600" cy="3433597"/>
+                      <a:ext cx="5943600" cy="3489779"/>
                     </a:xfrm>
                     <a:prstGeom prst="rect">
                       <a:avLst/>
@@ -1341,7 +1341,7 @@
         <w:lastRenderedPageBreak/>
         <w:drawing>
           <wp:inline distT="0" distB="0" distL="0" distR="0" wp14:anchorId="678D068E" wp14:editId="28415A37">
-            <wp:extent cx="5029200" cy="7273242"/>
+            <wp:extent cx="5669280" cy="8020419"/>
             <wp:effectExtent l="0" t="0" r="0" b="0"/>
             <wp:docPr id="7" name="Picture 7"/>
             <wp:cNvGraphicFramePr>
@@ -1363,7 +1363,7 @@
                   <pic:spPr>
                     <a:xfrm>
                       <a:off x="0" y="0"/>
-                      <a:ext cx="5029200" cy="7273242"/>
+                      <a:ext cx="5669280" cy="8020419"/>
                     </a:xfrm>
                     <a:prstGeom prst="rect">
                       <a:avLst/>
@@ -1639,7 +1639,7 @@
         </w:rPr>
         <w:drawing>
           <wp:inline distT="0" distB="0" distL="0" distR="0" wp14:anchorId="6E2EC7A5" wp14:editId="13ADF2B7">
-            <wp:extent cx="5943600" cy="1789250"/>
+            <wp:extent cx="5943600" cy="2085766"/>
             <wp:effectExtent l="0" t="0" r="0" b="0"/>
             <wp:docPr id="2" name="Picture 2"/>
             <wp:cNvGraphicFramePr>
@@ -1661,7 +1661,7 @@
                   <pic:spPr>
                     <a:xfrm>
                       <a:off x="0" y="0"/>
-                      <a:ext cx="5943600" cy="1789250"/>
+                      <a:ext cx="5943600" cy="2085766"/>
                     </a:xfrm>
                     <a:prstGeom prst="rect">
                       <a:avLst/>
@@ -1693,7 +1693,7 @@
         <w:lastRenderedPageBreak/>
         <w:drawing>
           <wp:inline distT="0" distB="0" distL="0" distR="0" wp14:anchorId="13450E01" wp14:editId="5B3706B1">
-            <wp:extent cx="4114800" cy="3312966"/>
+            <wp:extent cx="4389120" cy="3533830"/>
             <wp:effectExtent l="0" t="0" r="0" b="0"/>
             <wp:docPr id="6" name="Picture 6"/>
             <wp:cNvGraphicFramePr>
@@ -1715,7 +1715,7 @@
                   <pic:spPr>
                     <a:xfrm>
                       <a:off x="0" y="0"/>
-                      <a:ext cx="4114800" cy="3312966"/>
+                      <a:ext cx="4389120" cy="3533830"/>
                     </a:xfrm>
                     <a:prstGeom prst="rect">
                       <a:avLst/>
@@ -1751,7 +1751,7 @@
         </w:rPr>
         <w:drawing>
           <wp:inline distT="0" distB="0" distL="0" distR="0" wp14:anchorId="69089555" wp14:editId="0955C057">
-            <wp:extent cx="5943600" cy="2642432"/>
+            <wp:extent cx="5943600" cy="2719693"/>
             <wp:effectExtent l="0" t="0" r="0" b="0"/>
             <wp:docPr id="9" name="Picture 9"/>
             <wp:cNvGraphicFramePr>
@@ -1773,7 +1773,7 @@
                   <pic:spPr>
                     <a:xfrm>
                       <a:off x="0" y="0"/>
-                      <a:ext cx="5943600" cy="2642432"/>
+                      <a:ext cx="5943600" cy="2719693"/>
                     </a:xfrm>
                     <a:prstGeom prst="rect">
                       <a:avLst/>
@@ -1805,7 +1805,7 @@
         <w:lastRenderedPageBreak/>
         <w:drawing>
           <wp:inline distT="0" distB="0" distL="0" distR="0" wp14:anchorId="39C070A5" wp14:editId="26AE35C5">
-            <wp:extent cx="5943600" cy="2331300"/>
+            <wp:extent cx="5943600" cy="2331299"/>
             <wp:effectExtent l="0" t="0" r="0" b="0"/>
             <wp:docPr id="8" name="Picture 8"/>
             <wp:cNvGraphicFramePr>
@@ -1827,7 +1827,7 @@
                   <pic:spPr>
                     <a:xfrm>
                       <a:off x="0" y="0"/>
-                      <a:ext cx="5943600" cy="2331300"/>
+                      <a:ext cx="5943600" cy="2331299"/>
                     </a:xfrm>
                     <a:prstGeom prst="rect">
                       <a:avLst/>

</xml_diff>